<commit_message>
Logos einbinden (Web-Header, PPTX-Layouts, DOCX-Kopf)
Co-Authored-By: Claude Sonnet 5.5 <noreply@anthropic.com>
Claude-Session: https://claude.ai/code/session_01LZiKgyJNCoBGmUkDiAUEHD
</commit_message>
<xml_diff>
--- a/templates/ruv.docx
+++ b/templates/ruv.docx
@@ -275,12 +275,38 @@
       <w:pStyle w:val="Header"/>
     </w:pPr>
     <w:r>
-      <w:rPr>
-        <w:b/>
-        <w:color w:val="001957"/>
-        <w:sz w:val="24"/>
-      </w:rPr>
-      <w:t>R+V  [Logo-Platzhalter]</w:t>
+      <w:drawing>
+        <wp:inline xmlns:a="http://schemas.openxmlformats.org/drawingml/2006/main" xmlns:pic="http://schemas.openxmlformats.org/drawingml/2006/picture">
+          <wp:extent cx="858034" cy="576000"/>
+          <wp:docPr id="1" name="Picture 1"/>
+          <wp:cNvGraphicFramePr>
+            <a:graphicFrameLocks noChangeAspect="1"/>
+          </wp:cNvGraphicFramePr>
+          <a:graphic>
+            <a:graphicData uri="http://schemas.openxmlformats.org/drawingml/2006/picture">
+              <pic:pic>
+                <pic:nvPicPr>
+                  <pic:cNvPr id="0" name="ruv-logo_ohne-claim_positiv.png"/>
+                  <pic:cNvPicPr/>
+                </pic:nvPicPr>
+                <pic:blipFill>
+                  <a:blip r:embed="rId1"/>
+                  <a:stretch>
+                    <a:fillRect/>
+                  </a:stretch>
+                </pic:blipFill>
+                <pic:spPr>
+                  <a:xfrm>
+                    <a:off x="0" y="0"/>
+                    <a:ext cx="858034" cy="576000"/>
+                  </a:xfrm>
+                  <a:prstGeom prst="rect"/>
+                </pic:spPr>
+              </pic:pic>
+            </a:graphicData>
+          </a:graphic>
+        </wp:inline>
+      </w:drawing>
     </w:r>
   </w:p>
 </w:hdr>

</xml_diff>

<commit_message>
Corporate Wording: Leitfaden, Pruefskript, CLAUDE.md; Demotexte und Artefakt angepasst
Co-Authored-By: Claude Sonnet 5.5 <noreply@anthropic.com>
Claude-Session: https://claude.ai/code/session_01LZiKgyJNCoBGmUkDiAUEHD
</commit_message>
<xml_diff>
--- a/templates/ruv.docx
+++ b/templates/ruv.docx
@@ -15,12 +15,12 @@
         <w:pStyle w:val="Subtitle"/>
       </w:pPr>
       <w:r>
-        <w:t>Untertitel oder Topline</w:t>
+        <w:t>Topline oder Untertitel</w:t>
       </w:r>
     </w:p>
     <w:p>
       <w:r>
-        <w:t>Fließtext in Arial 11 pt, Dunkelblau. Hervorhebungen im Fließtext werden fett gesetzt.</w:t>
+        <w:t>Vielen Dank für Ihre Nachricht. Wir kümmern uns persönlich darum und melden uns in den nächsten Tagen bei Ihnen. Hervorhebungen setzen wir fett.</w:t>
       </w:r>
     </w:p>
     <w:p>
@@ -33,7 +33,7 @@
     </w:p>
     <w:p>
       <w:r>
-        <w:t>Beispieltext.</w:t>
+        <w:t>Gerne beraten wir Sie auch telefonisch.</w:t>
       </w:r>
     </w:p>
     <w:p>
@@ -49,7 +49,7 @@
         <w:pStyle w:val="ListBullet"/>
       </w:pPr>
       <w:r>
-        <w:t>Erster Punkt</w:t>
+        <w:t>Schicken Sie uns bitte noch Ihre Unterlagen.</w:t>
       </w:r>
     </w:p>
     <w:p>
@@ -57,7 +57,7 @@
         <w:pStyle w:val="ListBullet"/>
       </w:pPr>
       <w:r>
-        <w:t>Zweiter Punkt</w:t>
+        <w:t>Wir prüfen sie sorgfältig und antworten Ihnen schnell.</w:t>
       </w:r>
     </w:p>
     <w:p>
@@ -73,7 +73,7 @@
         <w:pStyle w:val="Quote"/>
       </w:pPr>
       <w:r>
-        <w:t>Zitat oder Hinweis</w:t>
+        <w:t>Sie müssen nichts weiter tun. Wir melden uns bei Ihnen.</w:t>
       </w:r>
     </w:p>
     <w:tbl>

</xml_diff>